<commit_message>
Update CrayCare app, ML, firmware, and deliverables
</commit_message>
<xml_diff>
--- a/docs/Deliverables/Development Tools.docx
+++ b/docs/Deliverables/Development Tools.docx
@@ -216,7 +216,7 @@
         </w:trPr>
         <w:tc>
           <w:tcPr>
-            <w:tcW w:w="2902" w:type="dxa"/>
+            <w:tcW w:w="3000" w:type="dxa"/>
             <w:tcBorders>
               <w:bottom w:val="single" w:color="000000" w:sz="4" w:space="0"/>
             </w:tcBorders>
@@ -267,7 +267,7 @@
         </w:tc>
         <w:tc>
           <w:tcPr>
-            <w:tcW w:w="2475" w:type="dxa"/>
+            <w:tcW w:w="2542" w:type="dxa"/>
           </w:tcPr>
           <w:p>
             <w:pPr>
@@ -315,7 +315,7 @@
         </w:tc>
         <w:tc>
           <w:tcPr>
-            <w:tcW w:w="3335" w:type="dxa"/>
+            <w:tcW w:w="3458" w:type="dxa"/>
           </w:tcPr>
           <w:p>
             <w:pPr>
@@ -384,7 +384,7 @@
         </w:trPr>
         <w:tc>
           <w:tcPr>
-            <w:tcW w:w="2902" w:type="dxa"/>
+            <w:tcW w:w="3000" w:type="dxa"/>
             <w:tcBorders>
               <w:top w:val="single" w:color="000000" w:sz="4" w:space="0"/>
               <w:left w:val="single" w:color="000000" w:sz="4" w:space="0"/>
@@ -440,7 +440,7 @@
         </w:tc>
         <w:tc>
           <w:tcPr>
-            <w:tcW w:w="2475" w:type="dxa"/>
+            <w:tcW w:w="2542" w:type="dxa"/>
             <w:tcBorders>
               <w:left w:val="single" w:color="000000" w:sz="4" w:space="0"/>
             </w:tcBorders>
@@ -493,7 +493,7 @@
         </w:tc>
         <w:tc>
           <w:tcPr>
-            <w:tcW w:w="3335" w:type="dxa"/>
+            <w:tcW w:w="3458" w:type="dxa"/>
             <w:vAlign w:val="top"/>
           </w:tcPr>
           <w:p>
@@ -564,7 +564,7 @@
         </w:trPr>
         <w:tc>
           <w:tcPr>
-            <w:tcW w:w="2902" w:type="dxa"/>
+            <w:tcW w:w="3000" w:type="dxa"/>
             <w:tcBorders>
               <w:top w:val="nil"/>
               <w:left w:val="single" w:color="000000" w:sz="4" w:space="0"/>
@@ -608,7 +608,7 @@
         </w:tc>
         <w:tc>
           <w:tcPr>
-            <w:tcW w:w="2475" w:type="dxa"/>
+            <w:tcW w:w="2542" w:type="dxa"/>
             <w:tcBorders>
               <w:left w:val="single" w:color="000000" w:sz="4" w:space="0"/>
             </w:tcBorders>
@@ -661,7 +661,7 @@
         </w:tc>
         <w:tc>
           <w:tcPr>
-            <w:tcW w:w="3335" w:type="dxa"/>
+            <w:tcW w:w="3458" w:type="dxa"/>
             <w:vAlign w:val="top"/>
           </w:tcPr>
           <w:p>
@@ -857,7 +857,7 @@
                 <w:sz w:val="22"/>
                 <w:szCs w:val="22"/>
               </w:rPr>
-              <w:t>Used for processing sensor history, training the Isolation Forest model, and running Water Quality Anomaly Detection.</w:t>
+              <w:t>Supports sensor-history processing and offline model training; the deployed Python Cloud Function loads the trained Isolation Forest model to analyze recent Firestore sensor history.</w:t>
             </w:r>
           </w:p>
         </w:tc>
@@ -884,7 +884,7 @@
         </w:trPr>
         <w:tc>
           <w:tcPr>
-            <w:tcW w:w="2902" w:type="dxa"/>
+            <w:tcW w:w="3000" w:type="dxa"/>
             <w:tcBorders>
               <w:top w:val="single" w:color="000000" w:sz="4" w:space="0"/>
               <w:left w:val="single" w:color="000000" w:sz="4" w:space="0"/>
@@ -938,7 +938,7 @@
         </w:tc>
         <w:tc>
           <w:tcPr>
-            <w:tcW w:w="2475" w:type="dxa"/>
+            <w:tcW w:w="2542" w:type="dxa"/>
             <w:tcBorders>
               <w:left w:val="single" w:color="000000" w:sz="4" w:space="0"/>
             </w:tcBorders>
@@ -989,7 +989,7 @@
         </w:tc>
         <w:tc>
           <w:tcPr>
-            <w:tcW w:w="3335" w:type="dxa"/>
+            <w:tcW w:w="3458" w:type="dxa"/>
           </w:tcPr>
           <w:p>
             <w:pPr>
@@ -1031,7 +1031,7 @@
                 <w:vertAlign w:val="baseline"/>
                 <w:lang w:val="en-US"/>
               </w:rPr>
-              <w:t>Used for creating the cross-platform mobile application interface and functionalities</w:t>
+              <w:t>Used with Dart to build the CrayCare application interface and app features.</w:t>
             </w:r>
           </w:p>
         </w:tc>
@@ -1058,7 +1058,7 @@
         </w:trPr>
         <w:tc>
           <w:tcPr>
-            <w:tcW w:w="2902" w:type="dxa"/>
+            <w:tcW w:w="3000" w:type="dxa"/>
             <w:tcBorders>
               <w:top w:val="single" w:color="000000" w:sz="4" w:space="0"/>
               <w:left w:val="single" w:color="000000" w:sz="4" w:space="0"/>
@@ -1116,7 +1116,7 @@
         </w:tc>
         <w:tc>
           <w:tcPr>
-            <w:tcW w:w="2475" w:type="dxa"/>
+            <w:tcW w:w="2542" w:type="dxa"/>
             <w:tcBorders>
               <w:left w:val="single" w:color="000000" w:sz="4" w:space="0"/>
             </w:tcBorders>
@@ -1169,7 +1169,7 @@
         </w:tc>
         <w:tc>
           <w:tcPr>
-            <w:tcW w:w="3335" w:type="dxa"/>
+            <w:tcW w:w="3458" w:type="dxa"/>
             <w:vAlign w:val="top"/>
           </w:tcPr>
           <w:p>
@@ -1242,7 +1242,7 @@
         </w:trPr>
         <w:tc>
           <w:tcPr>
-            <w:tcW w:w="2902" w:type="dxa"/>
+            <w:tcW w:w="3000" w:type="dxa"/>
             <w:tcBorders>
               <w:top w:val="single" w:color="000000" w:sz="4" w:space="0"/>
               <w:left w:val="single" w:color="000000" w:sz="4" w:space="0"/>
@@ -1296,7 +1296,7 @@
         </w:tc>
         <w:tc>
           <w:tcPr>
-            <w:tcW w:w="2475" w:type="dxa"/>
+            <w:tcW w:w="2542" w:type="dxa"/>
             <w:tcBorders>
               <w:left w:val="single" w:color="000000" w:sz="4" w:space="0"/>
             </w:tcBorders>
@@ -1347,49 +1347,15 @@
         </w:tc>
         <w:tc>
           <w:tcPr>
-            <w:tcW w:w="3335" w:type="dxa"/>
-          </w:tcPr>
-          <w:p>
-            <w:pPr>
-              <w:keepLines w:val="0"/>
-              <w:widowControl/>
-              <w:numPr>
-                <w:ilvl w:val="0"/>
-                <w:numId w:val="0"/>
-              </w:numPr>
-              <w:kinsoku/>
-              <w:wordWrap/>
-              <w:overflowPunct/>
-              <w:topLinePunct w:val="0"/>
-              <w:autoSpaceDE/>
-              <w:autoSpaceDN/>
-              <w:bidi w:val="0"/>
-              <w:adjustRightInd/>
-              <w:snapToGrid/>
-              <w:spacing w:after="181" w:afterLines="50" w:line="240" w:lineRule="auto"/>
-              <w:jc w:val="left"/>
-              <w:textAlignment w:val="auto"/>
-              <w:rPr>
-                <w:rFonts w:hint="default" w:ascii="Arial" w:hAnsi="Arial"/>
-                <w:b w:val="0"/>
-                <w:bCs w:val="0"/>
-                <w:sz w:val="22"/>
-                <w:szCs w:val="22"/>
-                <w:vertAlign w:val="baseline"/>
-                <w:lang w:val="en-US"/>
-              </w:rPr>
-            </w:pPr>
-            <w:r>
-              <w:rPr>
-                <w:rFonts w:hint="default" w:ascii="Arial" w:hAnsi="Arial"/>
-                <w:b w:val="0"/>
-                <w:bCs w:val="0"/>
-                <w:sz w:val="22"/>
-                <w:szCs w:val="22"/>
-                <w:vertAlign w:val="baseline"/>
-                <w:lang w:val="en-US"/>
-              </w:rPr>
-              <w:t>Used for editing, organizing, and debugging the mobile application source code</w:t>
+            <w:tcW w:w="3458" w:type="dxa"/>
+          </w:tcPr>
+          <w:p>
+            <w:pPr>
+              <w:widowControl w:val="0"/>
+              <w:jc w:val="both"/>
+            </w:pPr>
+            <w:r>
+              <w:t>Used for editing, organizing, and debugging the Flutter mobile application and ESP32 firmware source code.</w:t>
             </w:r>
           </w:p>
         </w:tc>
@@ -1418,9 +1384,9 @@
           <w:tcPr>
             <w:tcW w:w="3000" w:type="dxa"/>
             <w:tcBorders>
-              <w:top w:val="single" w:color="000000" w:sz="4" w:space="0"/>
+              <w:top w:val="nil"/>
               <w:left w:val="single" w:color="000000" w:sz="4" w:space="0"/>
-              <w:bottom w:val="nil"/>
+              <w:bottom w:val="single" w:color="000000" w:sz="4" w:space="0"/>
               <w:right w:val="single" w:color="000000" w:sz="4" w:space="0"/>
             </w:tcBorders>
             <w:vAlign w:val="top"/>
@@ -1458,7 +1424,7 @@
                 <w:szCs w:val="22"/>
                 <w:rtl w:val="0"/>
               </w:rPr>
-              <w:t>Design Tools</w:t>
+              <w:t xml:space="preserve"> </w:t>
             </w:r>
           </w:p>
         </w:tc>
@@ -1503,7 +1469,7 @@
                 <w:szCs w:val="22"/>
                 <w:rtl w:val="0"/>
               </w:rPr>
-              <w:t>Figma</w:t>
+              <w:t>Canva</w:t>
             </w:r>
           </w:p>
         </w:tc>
@@ -1545,7 +1511,7 @@
                 <w:szCs w:val="22"/>
                 <w:rtl w:val="0"/>
               </w:rPr>
-              <w:t>Used to create UI/UX prototypes and interactive wireframes.</w:t>
+              <w:t>Used for visual assets, infographics, and system documentation.</w:t>
             </w:r>
           </w:p>
         </w:tc>
@@ -1574,17 +1540,20 @@
           <w:tcPr>
             <w:tcW w:w="3000" w:type="dxa"/>
             <w:tcBorders>
-              <w:top w:val="nil"/>
+              <w:top w:val="single" w:color="000000" w:sz="4" w:space="0"/>
               <w:left w:val="single" w:color="000000" w:sz="4" w:space="0"/>
               <w:bottom w:val="single" w:color="000000" w:sz="4" w:space="0"/>
               <w:right w:val="single" w:color="000000" w:sz="4" w:space="0"/>
             </w:tcBorders>
-            <w:vAlign w:val="top"/>
-          </w:tcPr>
-          <w:p>
-            <w:pPr>
-              <w:keepLines w:val="0"/>
-              <w:widowControl/>
+          </w:tcPr>
+          <w:p>
+            <w:pPr>
+              <w:keepLines w:val="0"/>
+              <w:widowControl/>
+              <w:numPr>
+                <w:ilvl w:val="0"/>
+                <w:numId w:val="0"/>
+              </w:numPr>
               <w:kinsoku/>
               <w:wordWrap/>
               <w:overflowPunct/>
@@ -1609,12 +1578,15 @@
             </w:pPr>
             <w:r>
               <w:rPr>
-                <w:rFonts w:ascii="Arial" w:hAnsi="Arial" w:eastAsia="Arial" w:cs="Arial"/>
-                <w:sz w:val="22"/>
-                <w:szCs w:val="22"/>
-                <w:rtl w:val="0"/>
-              </w:rPr>
-              <w:t xml:space="preserve"> </w:t>
+                <w:rFonts w:hint="default" w:ascii="Arial" w:hAnsi="Arial"/>
+                <w:b w:val="0"/>
+                <w:bCs w:val="0"/>
+                <w:sz w:val="22"/>
+                <w:szCs w:val="22"/>
+                <w:vertAlign w:val="baseline"/>
+                <w:lang w:val="en-US"/>
+              </w:rPr>
+              <w:t>Microcontroller</w:t>
             </w:r>
           </w:p>
         </w:tc>
@@ -1624,12 +1596,63 @@
             <w:tcBorders>
               <w:left w:val="single" w:color="000000" w:sz="4" w:space="0"/>
             </w:tcBorders>
-            <w:vAlign w:val="top"/>
-          </w:tcPr>
-          <w:p>
-            <w:pPr>
-              <w:keepLines w:val="0"/>
-              <w:widowControl/>
+          </w:tcPr>
+          <w:p>
+            <w:pPr>
+              <w:keepLines w:val="0"/>
+              <w:widowControl/>
+              <w:numPr>
+                <w:ilvl w:val="0"/>
+                <w:numId w:val="0"/>
+              </w:numPr>
+              <w:kinsoku/>
+              <w:wordWrap/>
+              <w:overflowPunct/>
+              <w:topLinePunct w:val="0"/>
+              <w:autoSpaceDE/>
+              <w:autoSpaceDN/>
+              <w:bidi w:val="0"/>
+              <w:adjustRightInd/>
+              <w:snapToGrid/>
+              <w:spacing w:after="181" w:afterLines="50" w:line="240" w:lineRule="auto"/>
+              <w:jc w:val="both"/>
+              <w:textAlignment w:val="auto"/>
+              <w:rPr>
+                <w:rFonts w:hint="default" w:ascii="Arial" w:hAnsi="Arial"/>
+                <w:b w:val="0"/>
+                <w:bCs w:val="0"/>
+                <w:sz w:val="22"/>
+                <w:szCs w:val="22"/>
+                <w:vertAlign w:val="baseline"/>
+                <w:lang w:val="en-US"/>
+              </w:rPr>
+            </w:pPr>
+            <w:r>
+              <w:rPr>
+                <w:rFonts w:hint="default" w:ascii="Arial" w:hAnsi="Arial"/>
+                <w:b w:val="0"/>
+                <w:bCs w:val="0"/>
+                <w:sz w:val="22"/>
+                <w:szCs w:val="22"/>
+                <w:vertAlign w:val="baseline"/>
+                <w:lang w:val="en-US"/>
+              </w:rPr>
+              <w:t>ESP32</w:t>
+            </w:r>
+          </w:p>
+        </w:tc>
+        <w:tc>
+          <w:tcPr>
+            <w:tcW w:w="3458" w:type="dxa"/>
+          </w:tcPr>
+          <w:p>
+            <w:pPr>
+              <w:keepLines w:val="0"/>
+              <w:widowControl/>
+              <w:numPr>
+                <w:ilvl w:val="0"/>
+                <w:numId w:val="0"/>
+              </w:numPr>
               <w:kinsoku/>
               <w:wordWrap/>
               <w:overflowPunct/>
@@ -1654,54 +1677,15 @@
             </w:pPr>
             <w:r>
               <w:rPr>
-                <w:rFonts w:ascii="Arial" w:hAnsi="Arial" w:eastAsia="Arial" w:cs="Arial"/>
-                <w:sz w:val="22"/>
-                <w:szCs w:val="22"/>
-                <w:rtl w:val="0"/>
-              </w:rPr>
-              <w:t>Canva</w:t>
-            </w:r>
-          </w:p>
-        </w:tc>
-        <w:tc>
-          <w:tcPr>
-            <w:tcW w:w="3458" w:type="dxa"/>
-            <w:vAlign w:val="top"/>
-          </w:tcPr>
-          <w:p>
-            <w:pPr>
-              <w:keepLines w:val="0"/>
-              <w:widowControl/>
-              <w:kinsoku/>
-              <w:wordWrap/>
-              <w:overflowPunct/>
-              <w:topLinePunct w:val="0"/>
-              <w:autoSpaceDE/>
-              <w:autoSpaceDN/>
-              <w:bidi w:val="0"/>
-              <w:adjustRightInd/>
-              <w:snapToGrid/>
-              <w:spacing w:after="181" w:afterLines="50" w:line="240" w:lineRule="auto"/>
-              <w:jc w:val="left"/>
-              <w:textAlignment w:val="auto"/>
-              <w:rPr>
-                <w:rFonts w:hint="default" w:ascii="Arial" w:hAnsi="Arial"/>
-                <w:b w:val="0"/>
-                <w:bCs w:val="0"/>
-                <w:sz w:val="22"/>
-                <w:szCs w:val="22"/>
-                <w:vertAlign w:val="baseline"/>
-                <w:lang w:val="en-US"/>
-              </w:rPr>
-            </w:pPr>
-            <w:r>
-              <w:rPr>
-                <w:rFonts w:ascii="Arial" w:hAnsi="Arial" w:eastAsia="Arial" w:cs="Arial"/>
-                <w:sz w:val="22"/>
-                <w:szCs w:val="22"/>
-                <w:rtl w:val="0"/>
-              </w:rPr>
-              <w:t>Used for visual assets, infographics, and system documentation.</w:t>
+                <w:rFonts w:hint="default" w:ascii="Arial" w:hAnsi="Arial"/>
+                <w:b w:val="0"/>
+                <w:bCs w:val="0"/>
+                <w:sz w:val="22"/>
+                <w:szCs w:val="22"/>
+                <w:vertAlign w:val="baseline"/>
+                <w:lang w:val="en-US"/>
+              </w:rPr>
+              <w:t>Serves as the main processing unit for sensor monitoring, Wi-Fi communication, and automated hardware control</w:t>
             </w:r>
           </w:p>
         </w:tc>
@@ -1776,7 +1760,7 @@
                 <w:vertAlign w:val="baseline"/>
                 <w:lang w:val="en-US"/>
               </w:rPr>
-              <w:t>Microcontroller</w:t>
+              <w:t>Cloud Database Platform</w:t>
             </w:r>
           </w:p>
         </w:tc>
@@ -1805,29 +1789,29 @@
               <w:adjustRightInd/>
               <w:snapToGrid/>
               <w:spacing w:after="181" w:afterLines="50" w:line="240" w:lineRule="auto"/>
-              <w:jc w:val="both"/>
-              <w:textAlignment w:val="auto"/>
-              <w:rPr>
-                <w:rFonts w:hint="default" w:ascii="Arial" w:hAnsi="Arial"/>
-                <w:b w:val="0"/>
-                <w:bCs w:val="0"/>
-                <w:sz w:val="22"/>
-                <w:szCs w:val="22"/>
-                <w:vertAlign w:val="baseline"/>
-                <w:lang w:val="en-US"/>
-              </w:rPr>
-            </w:pPr>
-            <w:r>
-              <w:rPr>
-                <w:rFonts w:hint="default" w:ascii="Arial" w:hAnsi="Arial"/>
-                <w:b w:val="0"/>
-                <w:bCs w:val="0"/>
-                <w:sz w:val="22"/>
-                <w:szCs w:val="22"/>
-                <w:vertAlign w:val="baseline"/>
-                <w:lang w:val="en-US"/>
-              </w:rPr>
-              <w:t>ESP32</w:t>
+              <w:jc w:val="left"/>
+              <w:textAlignment w:val="auto"/>
+              <w:rPr>
+                <w:rFonts w:hint="default" w:ascii="Arial" w:hAnsi="Arial"/>
+                <w:b w:val="0"/>
+                <w:bCs w:val="0"/>
+                <w:sz w:val="22"/>
+                <w:szCs w:val="22"/>
+                <w:vertAlign w:val="baseline"/>
+                <w:lang w:val="en-US"/>
+              </w:rPr>
+            </w:pPr>
+            <w:r>
+              <w:rPr>
+                <w:rFonts w:hint="default" w:ascii="Arial" w:hAnsi="Arial"/>
+                <w:b w:val="0"/>
+                <w:bCs w:val="0"/>
+                <w:sz w:val="22"/>
+                <w:szCs w:val="22"/>
+                <w:vertAlign w:val="baseline"/>
+                <w:lang w:val="en-US"/>
+              </w:rPr>
+              <w:t>Cloud Firestore</w:t>
             </w:r>
           </w:p>
         </w:tc>
@@ -1875,7 +1859,7 @@
                 <w:vertAlign w:val="baseline"/>
                 <w:lang w:val="en-US"/>
               </w:rPr>
-              <w:t>Serves as the main processing unit for sensor monitoring, Wi-Fi communication, and automated hardware control</w:t>
+              <w:t>Used for storing, synchronizing, and managing real-time sensor and monitoring data</w:t>
             </w:r>
           </w:p>
         </w:tc>
@@ -1950,7 +1934,7 @@
                 <w:vertAlign w:val="baseline"/>
                 <w:lang w:val="en-US"/>
               </w:rPr>
-              <w:t>Cloud Database Platform</w:t>
+              <w:t>Authentication Service</w:t>
             </w:r>
           </w:p>
         </w:tc>
@@ -2001,7 +1985,7 @@
                 <w:vertAlign w:val="baseline"/>
                 <w:lang w:val="en-US"/>
               </w:rPr>
-              <w:t>Cloud Firestore</w:t>
+              <w:t>Firebase Authentication</w:t>
             </w:r>
           </w:p>
         </w:tc>
@@ -2049,7 +2033,7 @@
                 <w:vertAlign w:val="baseline"/>
                 <w:lang w:val="en-US"/>
               </w:rPr>
-              <w:t>Used for storing, synchronizing, and managing real-time sensor and monitoring data</w:t>
+              <w:t>Used for managing user access and account security within the mobile application</w:t>
             </w:r>
           </w:p>
         </w:tc>
@@ -2124,7 +2108,7 @@
                 <w:vertAlign w:val="baseline"/>
                 <w:lang w:val="en-US"/>
               </w:rPr>
-              <w:t>Authentication Service</w:t>
+              <w:t>Version Control System</w:t>
             </w:r>
           </w:p>
         </w:tc>
@@ -2175,7 +2159,7 @@
                 <w:vertAlign w:val="baseline"/>
                 <w:lang w:val="en-US"/>
               </w:rPr>
-              <w:t>Firebase Authentication</w:t>
+              <w:t>Git</w:t>
             </w:r>
           </w:p>
         </w:tc>
@@ -2223,7 +2207,7 @@
                 <w:vertAlign w:val="baseline"/>
                 <w:lang w:val="en-US"/>
               </w:rPr>
-              <w:t>Used for managing user access and account security within the mobile application</w:t>
+              <w:t>Used for tracking code revisions and managing source code changes throughout development</w:t>
             </w:r>
           </w:p>
         </w:tc>
@@ -2298,7 +2282,7 @@
                 <w:vertAlign w:val="baseline"/>
                 <w:lang w:val="en-US"/>
               </w:rPr>
-              <w:t>Version Control System</w:t>
+              <w:t>Collaboration Platform</w:t>
             </w:r>
           </w:p>
         </w:tc>
@@ -2349,7 +2333,7 @@
                 <w:vertAlign w:val="baseline"/>
                 <w:lang w:val="en-US"/>
               </w:rPr>
-              <w:t>Git</w:t>
+              <w:t>GitHub</w:t>
             </w:r>
           </w:p>
         </w:tc>
@@ -2397,7 +2381,7 @@
                 <w:vertAlign w:val="baseline"/>
                 <w:lang w:val="en-US"/>
               </w:rPr>
-              <w:t>Used for tracking code revisions and managing source code changes throughout development</w:t>
+              <w:t>Used for project backup, repository management, and collaborative development</w:t>
             </w:r>
           </w:p>
         </w:tc>
@@ -2462,354 +2446,8 @@
                 <w:lang w:val="en-US"/>
               </w:rPr>
             </w:pPr>
-            <w:r>
-              <w:rPr>
-                <w:rFonts w:hint="default" w:ascii="Arial" w:hAnsi="Arial"/>
-                <w:b w:val="0"/>
-                <w:bCs w:val="0"/>
-                <w:sz w:val="22"/>
-                <w:szCs w:val="22"/>
-                <w:vertAlign w:val="baseline"/>
-                <w:lang w:val="en-US"/>
-              </w:rPr>
-              <w:t>Collaboration Platform</w:t>
-            </w:r>
-          </w:p>
-        </w:tc>
-        <w:tc>
-          <w:tcPr>
-            <w:tcW w:w="2542" w:type="dxa"/>
-            <w:tcBorders>
-              <w:left w:val="single" w:color="000000" w:sz="4" w:space="0"/>
-            </w:tcBorders>
-          </w:tcPr>
-          <w:p>
-            <w:pPr>
-              <w:keepLines w:val="0"/>
-              <w:widowControl/>
-              <w:numPr>
-                <w:ilvl w:val="0"/>
-                <w:numId w:val="0"/>
-              </w:numPr>
-              <w:kinsoku/>
-              <w:wordWrap/>
-              <w:overflowPunct/>
-              <w:topLinePunct w:val="0"/>
-              <w:autoSpaceDE/>
-              <w:autoSpaceDN/>
-              <w:bidi w:val="0"/>
-              <w:adjustRightInd/>
-              <w:snapToGrid/>
-              <w:spacing w:after="181" w:afterLines="50" w:line="240" w:lineRule="auto"/>
-              <w:jc w:val="left"/>
-              <w:textAlignment w:val="auto"/>
-              <w:rPr>
-                <w:rFonts w:hint="default" w:ascii="Arial" w:hAnsi="Arial"/>
-                <w:b w:val="0"/>
-                <w:bCs w:val="0"/>
-                <w:sz w:val="22"/>
-                <w:szCs w:val="22"/>
-                <w:vertAlign w:val="baseline"/>
-                <w:lang w:val="en-US"/>
-              </w:rPr>
-            </w:pPr>
-            <w:r>
-              <w:rPr>
-                <w:rFonts w:hint="default" w:ascii="Arial" w:hAnsi="Arial"/>
-                <w:b w:val="0"/>
-                <w:bCs w:val="0"/>
-                <w:sz w:val="22"/>
-                <w:szCs w:val="22"/>
-                <w:vertAlign w:val="baseline"/>
-                <w:lang w:val="en-US"/>
-              </w:rPr>
-              <w:t>GitHub</w:t>
-            </w:r>
-          </w:p>
-        </w:tc>
-        <w:tc>
-          <w:tcPr>
-            <w:tcW w:w="3458" w:type="dxa"/>
-          </w:tcPr>
-          <w:p>
-            <w:pPr>
-              <w:keepLines w:val="0"/>
-              <w:widowControl/>
-              <w:numPr>
-                <w:ilvl w:val="0"/>
-                <w:numId w:val="0"/>
-              </w:numPr>
-              <w:kinsoku/>
-              <w:wordWrap/>
-              <w:overflowPunct/>
-              <w:topLinePunct w:val="0"/>
-              <w:autoSpaceDE/>
-              <w:autoSpaceDN/>
-              <w:bidi w:val="0"/>
-              <w:adjustRightInd/>
-              <w:snapToGrid/>
-              <w:spacing w:after="181" w:afterLines="50" w:line="240" w:lineRule="auto"/>
-              <w:jc w:val="left"/>
-              <w:textAlignment w:val="auto"/>
-              <w:rPr>
-                <w:rFonts w:hint="default" w:ascii="Arial" w:hAnsi="Arial"/>
-                <w:b w:val="0"/>
-                <w:bCs w:val="0"/>
-                <w:sz w:val="22"/>
-                <w:szCs w:val="22"/>
-                <w:vertAlign w:val="baseline"/>
-                <w:lang w:val="en-US"/>
-              </w:rPr>
-            </w:pPr>
-            <w:r>
-              <w:rPr>
-                <w:rFonts w:hint="default" w:ascii="Arial" w:hAnsi="Arial"/>
-                <w:b w:val="0"/>
-                <w:bCs w:val="0"/>
-                <w:sz w:val="22"/>
-                <w:szCs w:val="22"/>
-                <w:vertAlign w:val="baseline"/>
-                <w:lang w:val="en-US"/>
-              </w:rPr>
-              <w:t>Used for project backup, repository management, and collaborative development</w:t>
-            </w:r>
-          </w:p>
-        </w:tc>
-      </w:tr>
-      <w:tr>
-        <w:tblPrEx>
-          <w:tblBorders>
-            <w:top w:val="single" w:color="auto" w:sz="4" w:space="0"/>
-            <w:left w:val="single" w:color="auto" w:sz="4" w:space="0"/>
-            <w:bottom w:val="single" w:color="auto" w:sz="4" w:space="0"/>
-            <w:right w:val="single" w:color="auto" w:sz="4" w:space="0"/>
-            <w:insideH w:val="single" w:color="auto" w:sz="4" w:space="0"/>
-            <w:insideV w:val="single" w:color="auto" w:sz="4" w:space="0"/>
-          </w:tblBorders>
-          <w:tblCellMar>
-            <w:top w:w="0" w:type="dxa"/>
-            <w:left w:w="108" w:type="dxa"/>
-            <w:bottom w:w="0" w:type="dxa"/>
-            <w:right w:w="108" w:type="dxa"/>
-          </w:tblCellMar>
-        </w:tblPrEx>
-        <w:trPr>
-          <w:cantSplit/>
-        </w:trPr>
-        <w:tc>
-          <w:tcPr>
-            <w:tcW w:w="3000" w:type="dxa"/>
-            <w:tcBorders>
-              <w:top w:val="single" w:color="000000" w:sz="4" w:space="0"/>
-              <w:left w:val="single" w:color="000000" w:sz="4" w:space="0"/>
-              <w:bottom w:val="single" w:color="000000" w:sz="4" w:space="0"/>
-              <w:right w:val="single" w:color="000000" w:sz="4" w:space="0"/>
-            </w:tcBorders>
-          </w:tcPr>
-          <w:p>
-            <w:pPr>
-              <w:keepLines w:val="0"/>
-              <w:widowControl/>
-              <w:numPr>
-                <w:ilvl w:val="0"/>
-                <w:numId w:val="0"/>
-              </w:numPr>
-              <w:kinsoku/>
-              <w:wordWrap/>
-              <w:overflowPunct/>
-              <w:topLinePunct w:val="0"/>
-              <w:autoSpaceDE/>
-              <w:autoSpaceDN/>
-              <w:bidi w:val="0"/>
-              <w:adjustRightInd/>
-              <w:snapToGrid/>
-              <w:spacing w:after="181" w:afterLines="50" w:line="240" w:lineRule="auto"/>
-              <w:jc w:val="left"/>
-              <w:textAlignment w:val="auto"/>
-              <w:rPr>
-                <w:rFonts w:hint="default" w:ascii="Arial" w:hAnsi="Arial"/>
-                <w:b w:val="0"/>
-                <w:bCs w:val="0"/>
-                <w:sz w:val="22"/>
-                <w:szCs w:val="22"/>
-                <w:vertAlign w:val="baseline"/>
-                <w:lang w:val="en-US"/>
-              </w:rPr>
-            </w:pPr>
-            <w:r>
-              <w:rPr>
-                <w:rFonts w:hint="default" w:ascii="Arial" w:hAnsi="Arial"/>
-                <w:b w:val="0"/>
-                <w:bCs w:val="0"/>
-                <w:sz w:val="22"/>
-                <w:szCs w:val="22"/>
-                <w:vertAlign w:val="baseline"/>
-                <w:lang w:val="en-US"/>
-              </w:rPr>
-              <w:t>Prototyping Tools</w:t>
-            </w:r>
-          </w:p>
-        </w:tc>
-        <w:tc>
-          <w:tcPr>
-            <w:tcW w:w="2542" w:type="dxa"/>
-            <w:tcBorders>
-              <w:left w:val="single" w:color="000000" w:sz="4" w:space="0"/>
-            </w:tcBorders>
-          </w:tcPr>
-          <w:p>
-            <w:pPr>
-              <w:keepLines w:val="0"/>
-              <w:widowControl/>
-              <w:numPr>
-                <w:ilvl w:val="0"/>
-                <w:numId w:val="0"/>
-              </w:numPr>
-              <w:kinsoku/>
-              <w:wordWrap/>
-              <w:overflowPunct/>
-              <w:topLinePunct w:val="0"/>
-              <w:autoSpaceDE/>
-              <w:autoSpaceDN/>
-              <w:bidi w:val="0"/>
-              <w:adjustRightInd/>
-              <w:snapToGrid/>
-              <w:spacing w:after="181" w:afterLines="50" w:line="240" w:lineRule="auto"/>
-              <w:jc w:val="left"/>
-              <w:textAlignment w:val="auto"/>
-              <w:rPr>
-                <w:rFonts w:hint="default" w:ascii="Arial" w:hAnsi="Arial"/>
-                <w:b w:val="0"/>
-                <w:bCs w:val="0"/>
-                <w:sz w:val="22"/>
-                <w:szCs w:val="22"/>
-                <w:vertAlign w:val="baseline"/>
-                <w:lang w:val="en-US"/>
-              </w:rPr>
-            </w:pPr>
-            <w:r>
-              <w:rPr>
-                <w:rFonts w:hint="default" w:ascii="Arial" w:hAnsi="Arial"/>
-                <w:b w:val="0"/>
-                <w:bCs w:val="0"/>
-                <w:sz w:val="22"/>
-                <w:szCs w:val="22"/>
-                <w:vertAlign w:val="baseline"/>
-                <w:lang w:val="en-US"/>
-              </w:rPr>
-              <w:t>Breadboards and Jumper Wires</w:t>
-            </w:r>
-          </w:p>
-        </w:tc>
-        <w:tc>
-          <w:tcPr>
-            <w:tcW w:w="3458" w:type="dxa"/>
-          </w:tcPr>
-          <w:p>
-            <w:pPr>
-              <w:keepLines w:val="0"/>
-              <w:widowControl/>
-              <w:numPr>
-                <w:ilvl w:val="0"/>
-                <w:numId w:val="0"/>
-              </w:numPr>
-              <w:kinsoku/>
-              <w:wordWrap/>
-              <w:overflowPunct/>
-              <w:topLinePunct w:val="0"/>
-              <w:autoSpaceDE/>
-              <w:autoSpaceDN/>
-              <w:bidi w:val="0"/>
-              <w:adjustRightInd/>
-              <w:snapToGrid/>
-              <w:spacing w:after="181" w:afterLines="50" w:line="240" w:lineRule="auto"/>
-              <w:jc w:val="left"/>
-              <w:textAlignment w:val="auto"/>
-              <w:rPr>
-                <w:rFonts w:hint="default" w:ascii="Arial" w:hAnsi="Arial"/>
-                <w:b w:val="0"/>
-                <w:bCs w:val="0"/>
-                <w:sz w:val="22"/>
-                <w:szCs w:val="22"/>
-                <w:vertAlign w:val="baseline"/>
-                <w:lang w:val="en-US"/>
-              </w:rPr>
-            </w:pPr>
-            <w:r>
-              <w:rPr>
-                <w:rFonts w:hint="default" w:ascii="Arial" w:hAnsi="Arial"/>
-                <w:b w:val="0"/>
-                <w:bCs w:val="0"/>
-                <w:sz w:val="22"/>
-                <w:szCs w:val="22"/>
-                <w:vertAlign w:val="baseline"/>
-                <w:lang w:val="en-US"/>
-              </w:rPr>
-              <w:t>Used for temporary circuit assembly and hardware testing during prototyping</w:t>
-            </w:r>
-          </w:p>
-        </w:tc>
-      </w:tr>
-      <w:tr>
-        <w:tblPrEx>
-          <w:tblBorders>
-            <w:top w:val="single" w:color="auto" w:sz="4" w:space="0"/>
-            <w:left w:val="single" w:color="auto" w:sz="4" w:space="0"/>
-            <w:bottom w:val="single" w:color="auto" w:sz="4" w:space="0"/>
-            <w:right w:val="single" w:color="auto" w:sz="4" w:space="0"/>
-            <w:insideH w:val="single" w:color="auto" w:sz="4" w:space="0"/>
-            <w:insideV w:val="single" w:color="auto" w:sz="4" w:space="0"/>
-          </w:tblBorders>
-          <w:tblCellMar>
-            <w:top w:w="0" w:type="dxa"/>
-            <w:left w:w="108" w:type="dxa"/>
-            <w:bottom w:w="0" w:type="dxa"/>
-            <w:right w:w="108" w:type="dxa"/>
-          </w:tblCellMar>
-        </w:tblPrEx>
-        <w:trPr>
-          <w:cantSplit/>
-        </w:trPr>
-        <w:tc>
-          <w:tcPr>
-            <w:tcW w:w="3000" w:type="dxa"/>
-            <w:tcBorders>
-              <w:top w:val="single" w:color="000000" w:sz="4" w:space="0"/>
-              <w:left w:val="single" w:color="000000" w:sz="4" w:space="0"/>
-              <w:bottom w:val="single" w:color="000000" w:sz="4" w:space="0"/>
-              <w:right w:val="single" w:color="000000" w:sz="4" w:space="0"/>
-            </w:tcBorders>
-          </w:tcPr>
-          <w:p>
-            <w:pPr>
-              <w:keepLines w:val="0"/>
-              <w:widowControl/>
-              <w:numPr>
-                <w:ilvl w:val="0"/>
-                <w:numId w:val="0"/>
-              </w:numPr>
-              <w:kinsoku/>
-              <w:wordWrap/>
-              <w:overflowPunct/>
-              <w:topLinePunct w:val="0"/>
-              <w:autoSpaceDE/>
-              <w:autoSpaceDN/>
-              <w:bidi w:val="0"/>
-              <w:adjustRightInd/>
-              <w:snapToGrid/>
-              <w:spacing w:after="181" w:afterLines="50" w:line="240" w:lineRule="auto"/>
-              <w:jc w:val="left"/>
-              <w:textAlignment w:val="auto"/>
-              <w:rPr>
-                <w:rFonts w:hint="default" w:ascii="Arial" w:hAnsi="Arial"/>
-                <w:b w:val="0"/>
-                <w:bCs w:val="0"/>
-                <w:sz w:val="22"/>
-                <w:szCs w:val="22"/>
-                <w:vertAlign w:val="baseline"/>
-                <w:lang w:val="en-US"/>
-              </w:rPr>
-            </w:pPr>
+            <w:bookmarkStart w:id="0" w:name="_GoBack"/>
+            <w:bookmarkEnd w:id="0"/>
             <w:r>
               <w:rPr>
                 <w:sz w:val="22"/>
@@ -3897,8 +3535,6 @@
           <w:lang w:val="en-US"/>
         </w:rPr>
       </w:pPr>
-      <w:bookmarkStart w:id="0" w:name="_GoBack"/>
-      <w:bookmarkEnd w:id="0"/>
     </w:p>
     <w:p>
       <w:pPr>
@@ -3945,7 +3581,7 @@
           <w:szCs w:val="22"/>
           <w:lang w:val="en-US"/>
         </w:rPr>
-        <w:t>Table 3.32 presents the development tools and technologies intended to be used in the design, development, and implementation of the proposed CrayCare system. The listed tools support the different stages of system development, including hardware configuration, mobile application creation, database integration, interface design, testing, and project management.</w:t>
+        <w:t>Table 3.32 presents the development tools and technologies used in the design, development, and implementation of the CrayCare system. The listed tools support the different stages of system development, including hardware configuration, mobile application creation, database integration, interface design, testing, machine-learning analysis, deployment, and project management.</w:t>
       </w:r>
     </w:p>
     <w:p>
@@ -3993,7 +3629,7 @@
           <w:szCs w:val="22"/>
           <w:lang w:val="en-US"/>
         </w:rPr>
-        <w:t>The selection of these tools was based on suitability for the requirements of the proposed system and the ability to support the integration of hardware and software components. These tools will serve as the working environment for the researchers in developing and preparing the proposed system for implementation.</w:t>
+        <w:t>The selection of these tools is based on their suitability for the system requirements and their ability to support the integration of hardware and software components. These tools are used by the researchers to develop, test, deploy, and document the CrayCare system.</w:t>
       </w:r>
     </w:p>
     <w:sectPr>
@@ -5079,7 +4715,7 @@
     <w:lsdException w:qFormat="1" w:unhideWhenUsed="0" w:uiPriority="0" w:semiHidden="0" w:name="Title"/>
     <w:lsdException w:unhideWhenUsed="0" w:uiPriority="0" w:semiHidden="0" w:name="Closing"/>
     <w:lsdException w:unhideWhenUsed="0" w:uiPriority="0" w:semiHidden="0" w:name="Signature"/>
-    <w:lsdException w:unhideWhenUsed="0" w:uiPriority="0" w:name="Default Paragraph Font"/>
+    <w:lsdException w:qFormat="1" w:unhideWhenUsed="0" w:uiPriority="0" w:name="Default Paragraph Font"/>
     <w:lsdException w:unhideWhenUsed="0" w:uiPriority="0" w:semiHidden="0" w:name="Body Text"/>
     <w:lsdException w:unhideWhenUsed="0" w:uiPriority="0" w:semiHidden="0" w:name="Body Text Indent"/>
     <w:lsdException w:unhideWhenUsed="0" w:uiPriority="0" w:semiHidden="0" w:name="List Continue"/>
@@ -5339,6 +4975,7 @@
   <w:style w:type="character" w:default="1" w:styleId="5">
     <w:name w:val="Default Paragraph Font"/>
     <w:semiHidden/>
+    <w:qFormat/>
     <w:uiPriority w:val="0"/>
   </w:style>
   <w:style w:type="table" w:default="1" w:styleId="6">
@@ -5495,6 +5132,7 @@
     <w:name w:val="Heading 2 Char"/>
     <w:basedOn w:val="5"/>
     <w:link w:val="3"/>
+    <w:qFormat/>
     <w:uiPriority w:val="9"/>
     <w:rPr>
       <w:rFonts w:asciiTheme="majorHAnsi" w:hAnsiTheme="majorHAnsi" w:eastAsiaTheme="majorEastAsia" w:cstheme="majorBidi"/>
@@ -5530,6 +5168,7 @@
   <w:style w:type="table" w:customStyle="1" w:styleId="20">
     <w:name w:val="_Style 10"/>
     <w:basedOn w:val="21"/>
+    <w:qFormat/>
     <w:uiPriority w:val="0"/>
   </w:style>
   <w:style w:type="table" w:customStyle="1" w:styleId="21">

</xml_diff>